<commit_message>
Apply Fabio + Ivan review as source of truth; richer one-pager PDF
</commit_message>
<xml_diff>
--- a/cjr-discovery/CJR_Email_Cliente.docx
+++ b/cjr-discovery/CJR_Email_Cliente.docx
@@ -23,7 +23,7 @@
     </w:p>
     <w:p>
       <w:r>
-        <w:t>Em resumo: durante duas semanas vamos compreender os vossos processos de procurement e identificar, em conjunto convosco, por onde faz mais sentido começar. Cada semana tem 2 dias presenciais com workshops e 3 dias de consolidação, e fecha com uma review session com os principais stakeholders. No fim, saímos com o fluxo atual documentado, uma baseline quantificada, o âmbito do piloto fechado, os KPIs de impacto definidos e um plano de implementação faseado. A implementação arranca logo na semana seguinte.</w:t>
+        <w:t>Em resumo: durante duas semanas vamos compreender os vossos processos de procurement e, em parceria, identificar por onde faz mais sentido começar. Cada semana tem 2 dias presenciais com workshops e 3 dias de consolidação, e fecha com uma review session com os principais stakeholders. No fim, saímos com o fluxo atual documentado, uma baseline quantificada, o âmbito do piloto fechado, os KPIs definidos e um plano de implementação faseado. A implementação arranca logo na semana seguinte.</w:t>
       </w:r>
     </w:p>
     <w:p>
@@ -39,10 +39,10 @@
         <w:rPr>
           <w:b/>
         </w:rPr>
-        <w:t xml:space="preserve">Stakeholders do projeto: </w:t>
+        <w:t xml:space="preserve">Intervenientes e responsáveis: </w:t>
       </w:r>
       <w:r>
-        <w:t>o plano inclui uma lista das pessoas que assumimos necessárias em cada sessão. Mais do que participantes, são os stakeholders que vão acompanhar o projeto e trabalhar connosco, durante o discovery e ao longo da implementação. Esta lista é um pressuposto da nossa parte; pedimos a vossa ajuda para confirmar quem vai acompanhar o projeto convosco e estar presente em cada sessão.</w:t>
+        <w:t>o plano inclui uma lista dos responsáveis e intervenientes que assumimos necessários em cada sessão. Esta lista é uma assunção da nossa parte; pedimos a vossa ajuda para confirmar quem deve estar presente em cada sessão.</w:t>
       </w:r>
     </w:p>
     <w:p>
@@ -70,7 +70,7 @@
         <w:t xml:space="preserve">Disponibilidade das equipas: </w:t>
       </w:r>
       <w:r>
-        <w:t>Procurement (P&amp;P), Comercial, Financeiro, Compliance, Qualidade, IT e Construção, nos dias das sessões.</w:t>
+        <w:t>Procurement, Comercial, Financeiro, Compliance, Qualidade e IT, nos dias das sessões.</w:t>
       </w:r>
     </w:p>
     <w:p>
@@ -84,7 +84,7 @@
         <w:t xml:space="preserve">Amostra de tickets: </w:t>
       </w:r>
       <w:r>
-        <w:t>tickets de Procurement recentes, de ponta a ponta, cobrindo compras de Projeto e de Armazém, incluindo pelo menos um ticket sem requisição SAP prévia e um caso de criação de um novo código de material.</w:t>
+        <w:t>tickets de Procurement recentes, cobrindo compras de Projeto e de Armazém, incluindo pelo menos um ticket sem requisição SAP prévia e um caso de criação de um novo código de material.</w:t>
       </w:r>
     </w:p>
     <w:p>
@@ -126,7 +126,7 @@
         <w:t xml:space="preserve">Acessos sandbox (SAP/SharePoint): </w:t>
       </w:r>
       <w:r>
-        <w:t>pedimos que os pedidos de acesso sejam submetidos logo no dia 1 ou 2 da primeira semana. Estes circuitos de aprovação demoram semanas e queremos garantir que nada atrasa o arranque da implementação.</w:t>
+        <w:t>pedimos que os pedidos de acesso sejam submetidos durante a primeira semana, para que nada bloqueie o arranque da implementação.</w:t>
       </w:r>
     </w:p>
     <w:p>

</xml_diff>